<commit_message>
fix(docs): unifica el Modelo de Dominio en un solo diagrama con todas las relaciones
Las 12 clases entraban en un único diagrama, así que se reemplazan los
dos diagramas separados (DM-1/DM-2) por uno solo. Esto corrige que
Appointment quedaba en un diagrama distinto de Applicant y Assignment:
sus relaciones (turno-solicitante, turno-asignación de retiro) estaban
solo mencionadas en una nota de texto en vez de dibujadas. Ahora las
12 asociaciones reales están todas trazadas en el mismo diagrama.
Se regenera también el documento combinado del TP.
</commit_message>
<xml_diff>
--- a/docs/modelo-dominio/MODELO_DE_DOMINIO.docx
+++ b/docs/modelo-dominio/MODELO_DE_DOMINIO.docx
@@ -102,7 +102,19 @@
         <w:spacing w:after="180" w:before="420"/>
       </w:pPr>
       <w:r>
-        <w:t xml:space="preserve">Diagrama — Solicitantes, Donaciones e Inventario (DM-1)</w:t>
+        <w:t xml:space="preserve">Diagrama</w:t>
+      </w:r>
+    </w:p>
+    <w:p>
+      <w:pPr>
+        <w:spacing w:after="140"/>
+      </w:pPr>
+      <w:r>
+        <w:rPr>
+          <w:i/>
+          <w:iCs/>
+        </w:rPr>
+        <w:t xml:space="preserve">Las 12 clases del dominio y sus 12 asociaciones, todas en un único diagrama (ninguna relación queda relegada a una nota de texto).</w:t>
       </w:r>
     </w:p>
     <w:tbl>
@@ -144,7 +156,7 @@
             <w:r>
               <w:drawing>
                 <wp:inline distT="0" distB="0" distL="0" distR="0">
-                  <wp:extent cx="6276975" cy="3400425"/>
+                  <wp:extent cx="6276975" cy="4552950"/>
                   <wp:effectExtent t="0" r="0" b="0" l="0"/>
                   <wp:docPr id="1" name="" descr="" title=""/>
                   <wp:cNvGraphicFramePr>
@@ -169,96 +181,7 @@
                         <pic:spPr bwMode="auto">
                           <a:xfrm>
                             <a:off x="0" y="0"/>
-                            <a:ext cx="6276975" cy="3400425"/>
-                          </a:xfrm>
-                          <a:prstGeom prst="rect">
-                            <a:avLst/>
-                          </a:prstGeom>
-                        </pic:spPr>
-                      </pic:pic>
-                    </a:graphicData>
-                  </a:graphic>
-                </wp:inline>
-              </w:drawing>
-            </w:r>
-          </w:p>
-        </w:tc>
-      </w:tr>
-    </w:tbl>
-    <w:p>
-      <w:pPr>
-        <w:pStyle w:val="Heading1"/>
-        <w:spacing w:after="180" w:before="420"/>
-      </w:pPr>
-      <w:r>
-        <w:t xml:space="preserve">Diagrama — Turnos, Logística y Catálogo (DM-2)</w:t>
-      </w:r>
-    </w:p>
-    <w:tbl>
-      <w:tblPr>
-        <w:tblW w:type="dxa" w:w="10080"/>
-        <w:tblBorders>
-          <w:top w:val="single" w:color="auto" w:sz="4"/>
-          <w:left w:val="single" w:color="auto" w:sz="4"/>
-          <w:bottom w:val="single" w:color="auto" w:sz="4"/>
-          <w:right w:val="single" w:color="auto" w:sz="4"/>
-          <w:insideH w:val="single" w:color="auto" w:sz="4"/>
-          <w:insideV w:val="single" w:color="auto" w:sz="4"/>
-        </w:tblBorders>
-      </w:tblPr>
-      <w:tblGrid>
-        <w:gridCol w:w="10080"/>
-      </w:tblGrid>
-      <w:tr>
-        <w:tc>
-          <w:tcPr>
-            <w:tcW w:type="dxa" w:w="10080"/>
-            <w:tcBorders>
-              <w:top w:val="single" w:color="999999" w:sz="4"/>
-              <w:left w:val="single" w:color="999999" w:sz="4"/>
-              <w:bottom w:val="single" w:color="999999" w:sz="4"/>
-              <w:right w:val="single" w:color="999999" w:sz="4"/>
-            </w:tcBorders>
-            <w:tcMar>
-              <w:top w:type="dxa" w:w="100"/>
-              <w:left w:type="dxa" w:w="100"/>
-              <w:bottom w:type="dxa" w:w="100"/>
-              <w:right w:type="dxa" w:w="100"/>
-            </w:tcMar>
-          </w:tcPr>
-          <w:p>
-            <w:pPr>
-              <w:jc w:val="center"/>
-            </w:pPr>
-            <w:r>
-              <w:drawing>
-                <wp:inline distT="0" distB="0" distL="0" distR="0">
-                  <wp:extent cx="6276975" cy="2762250"/>
-                  <wp:effectExtent t="0" r="0" b="0" l="0"/>
-                  <wp:docPr id="1" name="" descr="" title=""/>
-                  <wp:cNvGraphicFramePr>
-                    <a:graphicFrameLocks xmlns:a="http://schemas.openxmlformats.org/drawingml/2006/main" noChangeAspect="1"/>
-                  </wp:cNvGraphicFramePr>
-                  <a:graphic xmlns:a="http://schemas.openxmlformats.org/drawingml/2006/main">
-                    <a:graphicData uri="http://schemas.openxmlformats.org/drawingml/2006/picture">
-                      <pic:pic xmlns:pic="http://schemas.openxmlformats.org/drawingml/2006/picture">
-                        <pic:nvPicPr>
-                          <pic:cNvPr id="0" name="" descr=""/>
-                          <pic:cNvPicPr>
-                            <a:picLocks noChangeAspect="1" noChangeArrowheads="1"/>
-                          </pic:cNvPicPr>
-                        </pic:nvPicPr>
-                        <pic:blipFill>
-                          <a:blip r:embed="rId10" cstate="none"/>
-                          <a:srcRect/>
-                          <a:stretch>
-                            <a:fillRect/>
-                          </a:stretch>
-                        </pic:blipFill>
-                        <pic:spPr bwMode="auto">
-                          <a:xfrm>
-                            <a:off x="0" y="0"/>
-                            <a:ext cx="6276975" cy="2762250"/>
+                            <a:ext cx="6276975" cy="4552950"/>
                           </a:xfrm>
                           <a:prstGeom prst="rect">
                             <a:avLst/>

</xml_diff>